<commit_message>
Add future-work note on automating risk alerts into hospital inventory/SCM systems
</commit_message>
<xml_diff>
--- a/docs/case_study.docx
+++ b/docs/case_study.docx
@@ -1585,7 +1585,7 @@
         </w:rPr>
         <w:t xml:space="preserve">Metronidazole — </w:t>
       </w:r>
-      <w:hyperlink w:history="1" r:id="rIdofriy4k0fgczwn2ajfdlw">
+      <w:hyperlink w:history="1" r:id="rIdwerxxxfnhlhqqca9wf9jr">
         <w:r>
           <w:rPr>
             <w:rFonts w:ascii="Calibri" w:cs="Calibri" w:eastAsia="Calibri" w:hAnsi="Calibri"/>
@@ -1610,7 +1610,7 @@
         </w:rPr>
         <w:t xml:space="preserve">   |   Clindamycin — </w:t>
       </w:r>
-      <w:hyperlink w:history="1" r:id="rId0cu9utzvaqkpz2gs57bhp">
+      <w:hyperlink w:history="1" r:id="rIdw82fkdwaz2ayrxs-u4hub">
         <w:r>
           <w:rPr>
             <w:rFonts w:ascii="Calibri" w:cs="Calibri" w:eastAsia="Calibri" w:hAnsi="Calibri"/>
@@ -1635,7 +1635,7 @@
         </w:rPr>
         <w:t xml:space="preserve">   |   Belladonna/Opium — </w:t>
       </w:r>
-      <w:hyperlink w:history="1" r:id="rId0tg6w8cgwmhqxhxe7w_op">
+      <w:hyperlink w:history="1" r:id="rIdggrpus19itp3awe89t3al">
         <w:r>
           <w:rPr>
             <w:rFonts w:ascii="Calibri" w:cs="Calibri" w:eastAsia="Calibri" w:hAnsi="Calibri"/>
@@ -1665,7 +1665,7 @@
         </w:rPr>
         <w:t xml:space="preserve">Lidocaine — </w:t>
       </w:r>
-      <w:hyperlink w:history="1" r:id="rIdja0no2kdlihoneeo75q18">
+      <w:hyperlink w:history="1" r:id="rId4bmd68ku7t248zkjdgcu8">
         <w:r>
           <w:rPr>
             <w:rFonts w:ascii="Calibri" w:cs="Calibri" w:eastAsia="Calibri" w:hAnsi="Calibri"/>
@@ -1690,7 +1690,7 @@
         </w:rPr>
         <w:t xml:space="preserve">   |   Doxercalciferol — </w:t>
       </w:r>
-      <w:hyperlink w:history="1" r:id="rIdannrcmd02fzg_11njs_g7">
+      <w:hyperlink w:history="1" r:id="rIdm3_0ya1oej9dltf_bn2bk">
         <w:r>
           <w:rPr>
             <w:rFonts w:ascii="Calibri" w:cs="Calibri" w:eastAsia="Calibri" w:hAnsi="Calibri"/>
@@ -1794,6 +1794,25 @@
           <w:szCs w:val="22"/>
         </w:rPr>
         <w:t xml:space="preserve">Rankings may shift once demand is calculated from the full patient population instead of the 100-patient sample.</w:t>
+      </w:r>
+    </w:p>
+    <w:p>
+      <w:pPr>
+        <w:pStyle w:val="ListParagraph"/>
+        <w:numPr>
+          <w:ilvl w:val="0"/>
+          <w:numId w:val="1"/>
+        </w:numPr>
+        <w:spacing w:after="100" w:line="276" w:lineRule="auto"/>
+      </w:pPr>
+      <w:r>
+        <w:rPr>
+          <w:rFonts w:ascii="Calibri" w:cs="Calibri" w:eastAsia="Calibri" w:hAnsi="Calibri"/>
+          <w:color w:val="222222"/>
+          <w:sz w:val="22"/>
+          <w:szCs w:val="22"/>
+        </w:rPr>
+        <w:t xml:space="preserve">A natural next step is automating this into a hospital's existing inventory or supply chain management (SCM) system, so that reorder points and high-risk alerts are pushed directly into the workflow a pharmacy team already uses, rather than requiring someone to check a separate dashboard.</w:t>
       </w:r>
     </w:p>
     <w:p>

</xml_diff>